<commit_message>
Add documentation: Jenkins Installation
</commit_message>
<xml_diff>
--- a/Resources/Documentations/GIT_Tutorial.docx
+++ b/Resources/Documentations/GIT_Tutorial.docx
@@ -578,6 +578,70 @@
         <w:rPr>
           <w:color w:val="4EA72E" w:themeColor="accent6"/>
         </w:rPr>
+        <w:t xml:space="preserve">git fetch origin </w:t>
+      </w:r>
+      <w:r>
+        <w:t>-&gt; d</w:t>
+      </w:r>
+      <w:r>
+        <w:t>ownload objects and refs from another repository</w:t>
+      </w:r>
+    </w:p>
+    <w:p>
+      <w:pPr>
+        <w:spacing w:after="0" w:line="276" w:lineRule="auto"/>
+      </w:pPr>
+      <w:r>
+        <w:drawing>
+          <wp:inline distT="0" distB="0" distL="0" distR="0" wp14:anchorId="65C65A55" wp14:editId="04929639">
+            <wp:extent cx="4978400" cy="458903"/>
+            <wp:effectExtent l="0" t="0" r="0" b="0"/>
+            <wp:docPr id="1161655289" name="Picture 1"/>
+            <wp:cNvGraphicFramePr>
+              <a:graphicFrameLocks xmlns:a="http://schemas.openxmlformats.org/drawingml/2006/main" noChangeAspect="1"/>
+            </wp:cNvGraphicFramePr>
+            <a:graphic xmlns:a="http://schemas.openxmlformats.org/drawingml/2006/main">
+              <a:graphicData uri="http://schemas.openxmlformats.org/drawingml/2006/picture">
+                <pic:pic xmlns:pic="http://schemas.openxmlformats.org/drawingml/2006/picture">
+                  <pic:nvPicPr>
+                    <pic:cNvPr id="1161655289" name=""/>
+                    <pic:cNvPicPr/>
+                  </pic:nvPicPr>
+                  <pic:blipFill>
+                    <a:blip r:embed="rId11"/>
+                    <a:stretch>
+                      <a:fillRect/>
+                    </a:stretch>
+                  </pic:blipFill>
+                  <pic:spPr>
+                    <a:xfrm>
+                      <a:off x="0" y="0"/>
+                      <a:ext cx="5010705" cy="461881"/>
+                    </a:xfrm>
+                    <a:prstGeom prst="rect">
+                      <a:avLst/>
+                    </a:prstGeom>
+                  </pic:spPr>
+                </pic:pic>
+              </a:graphicData>
+            </a:graphic>
+          </wp:inline>
+        </w:drawing>
+      </w:r>
+    </w:p>
+    <w:p>
+      <w:pPr>
+        <w:spacing w:after="0" w:line="276" w:lineRule="auto"/>
+      </w:pPr>
+    </w:p>
+    <w:p>
+      <w:pPr>
+        <w:spacing w:after="0" w:line="276" w:lineRule="auto"/>
+      </w:pPr>
+      <w:r>
+        <w:rPr>
+          <w:color w:val="4EA72E" w:themeColor="accent6"/>
+        </w:rPr>
         <w:t>git checkout -b &lt;</w:t>
       </w:r>
       <w:proofErr w:type="spellStart"/>
@@ -622,7 +686,7 @@
                     <pic:cNvPicPr/>
                   </pic:nvPicPr>
                   <pic:blipFill>
-                    <a:blip r:embed="rId11"/>
+                    <a:blip r:embed="rId12"/>
                     <a:stretch>
                       <a:fillRect/>
                     </a:stretch>
@@ -692,7 +756,7 @@
                     <pic:cNvPicPr/>
                   </pic:nvPicPr>
                   <pic:blipFill>
-                    <a:blip r:embed="rId12"/>
+                    <a:blip r:embed="rId13"/>
                     <a:stretch>
                       <a:fillRect/>
                     </a:stretch>

</xml_diff>